<commit_message>
README.md verbeterd en schermopname van de website toegevoegd
</commit_message>
<xml_diff>
--- a/hustlefit/Week 3/STANDUP week 4 sprint 2.docx
+++ b/hustlefit/Week 3/STANDUP week 4 sprint 2.docx
@@ -20,13 +20,119 @@
       <w:r>
         <w:t xml:space="preserve">Aanwezig: </w:t>
       </w:r>
-      <w:proofErr w:type="spellStart"/>
+      <w:r>
+        <w:t xml:space="preserve">Furkan, </w:t>
+      </w:r>
+      <w:proofErr w:type="spellStart"/>
+      <w:r>
+        <w:t>Zhulide</w:t>
+      </w:r>
+      <w:proofErr w:type="spellEnd"/>
+      <w:r>
+        <w:t xml:space="preserve"> en Berke</w:t>
+      </w:r>
+    </w:p>
+    <w:p>
+      <w:r>
+        <w:t xml:space="preserve">Afwezig: </w:t>
+      </w:r>
+      <w:proofErr w:type="spellStart"/>
+      <w:r>
+        <w:t>Vitaliy</w:t>
+      </w:r>
+      <w:proofErr w:type="spellEnd"/>
+      <w:r>
+        <w:t xml:space="preserve"> en </w:t>
+      </w:r>
+      <w:proofErr w:type="spellStart"/>
+      <w:r>
+        <w:t>Saied</w:t>
+      </w:r>
+      <w:proofErr w:type="spellEnd"/>
+    </w:p>
+    <w:p>
+      <w:r>
+        <w:t xml:space="preserve">Datum: </w:t>
+      </w:r>
+      <w:r>
+        <w:t>10-3-2025</w:t>
+      </w:r>
+    </w:p>
+    <w:p>
+      <w:pPr>
+        <w:pStyle w:val="Lijstalinea"/>
+        <w:numPr>
+          <w:ilvl w:val="0"/>
+          <w:numId w:val="1"/>
+        </w:numPr>
+      </w:pPr>
+      <w:r>
+        <w:t xml:space="preserve">Wat heb je gedaan sinds de vorige </w:t>
+      </w:r>
+      <w:proofErr w:type="spellStart"/>
+      <w:r>
+        <w:t>standup</w:t>
+      </w:r>
+      <w:proofErr w:type="spellEnd"/>
+      <w:r>
+        <w:t>?</w:t>
+      </w:r>
+    </w:p>
+    <w:p>
+      <w:pPr>
+        <w:pStyle w:val="Lijstalinea"/>
+        <w:numPr>
+          <w:ilvl w:val="1"/>
+          <w:numId w:val="1"/>
+        </w:numPr>
+      </w:pPr>
+      <w:r>
+        <w:t xml:space="preserve">Teamlid </w:t>
+      </w:r>
       <w:r>
         <w:t>Furkan</w:t>
       </w:r>
-      <w:proofErr w:type="spellEnd"/>
-      <w:r>
-        <w:t xml:space="preserve">, </w:t>
+      <w:r>
+        <w:t>:</w:t>
+      </w:r>
+      <w:r>
+        <w:t xml:space="preserve"> </w:t>
+      </w:r>
+      <w:proofErr w:type="spellStart"/>
+      <w:r>
+        <w:t>Html,css</w:t>
+      </w:r>
+      <w:proofErr w:type="spellEnd"/>
+      <w:r>
+        <w:t xml:space="preserve"> scrumboard gemaakt alles in </w:t>
+      </w:r>
+      <w:proofErr w:type="spellStart"/>
+      <w:r>
+        <w:t>Github</w:t>
+      </w:r>
+      <w:proofErr w:type="spellEnd"/>
+      <w:r>
+        <w:t xml:space="preserve"> gezet en </w:t>
+      </w:r>
+      <w:proofErr w:type="spellStart"/>
+      <w:r>
+        <w:t>wireframes</w:t>
+      </w:r>
+      <w:proofErr w:type="spellEnd"/>
+      <w:r>
+        <w:t xml:space="preserve"> gemaakt.</w:t>
+      </w:r>
+    </w:p>
+    <w:p>
+      <w:pPr>
+        <w:pStyle w:val="Lijstalinea"/>
+        <w:numPr>
+          <w:ilvl w:val="1"/>
+          <w:numId w:val="1"/>
+        </w:numPr>
+      </w:pPr>
+      <w:r>
+        <w:t xml:space="preserve">Teamlid </w:t>
       </w:r>
       <w:proofErr w:type="spellStart"/>
       <w:r>
@@ -34,12 +140,82 @@
       </w:r>
       <w:proofErr w:type="spellEnd"/>
       <w:r>
-        <w:t xml:space="preserve"> en Berke</w:t>
-      </w:r>
-    </w:p>
-    <w:p>
-      <w:r>
-        <w:t xml:space="preserve">Afwezig: </w:t>
+        <w:t>:</w:t>
+      </w:r>
+      <w:r>
+        <w:t xml:space="preserve"> Kleding maken en homepagina ontworpen en ze heeft homepage aangepast.</w:t>
+      </w:r>
+    </w:p>
+    <w:p>
+      <w:pPr>
+        <w:pStyle w:val="Lijstalinea"/>
+        <w:numPr>
+          <w:ilvl w:val="1"/>
+          <w:numId w:val="1"/>
+        </w:numPr>
+      </w:pPr>
+      <w:r>
+        <w:t xml:space="preserve">Teamlid </w:t>
+      </w:r>
+      <w:r>
+        <w:t>Berke</w:t>
+      </w:r>
+      <w:r>
+        <w:t>:</w:t>
+      </w:r>
+      <w:r>
+        <w:t xml:space="preserve"> Alle verslagen gemaakt en alles bijgehouden</w:t>
+      </w:r>
+    </w:p>
+    <w:p>
+      <w:pPr>
+        <w:pStyle w:val="Lijstalinea"/>
+        <w:numPr>
+          <w:ilvl w:val="1"/>
+          <w:numId w:val="1"/>
+        </w:numPr>
+      </w:pPr>
+      <w:r>
+        <w:t xml:space="preserve">Teamlid </w:t>
+      </w:r>
+      <w:proofErr w:type="spellStart"/>
+      <w:r>
+        <w:t>Saied</w:t>
+      </w:r>
+      <w:proofErr w:type="spellEnd"/>
+      <w:r>
+        <w:t>:</w:t>
+      </w:r>
+      <w:r>
+        <w:t xml:space="preserve"> </w:t>
+      </w:r>
+      <w:proofErr w:type="spellStart"/>
+      <w:r>
+        <w:t>Github</w:t>
+      </w:r>
+      <w:proofErr w:type="spellEnd"/>
+      <w:r>
+        <w:t xml:space="preserve"> </w:t>
+      </w:r>
+      <w:proofErr w:type="spellStart"/>
+      <w:r>
+        <w:t>repository</w:t>
+      </w:r>
+      <w:proofErr w:type="spellEnd"/>
+      <w:r>
+        <w:t xml:space="preserve"> gemaakt en mappenstructuur aangemaakt.</w:t>
+      </w:r>
+    </w:p>
+    <w:p>
+      <w:pPr>
+        <w:pStyle w:val="Lijstalinea"/>
+        <w:numPr>
+          <w:ilvl w:val="1"/>
+          <w:numId w:val="1"/>
+        </w:numPr>
+      </w:pPr>
+      <w:r>
+        <w:t xml:space="preserve">Teamlid </w:t>
       </w:r>
       <w:proofErr w:type="spellStart"/>
       <w:r>
@@ -47,22 +223,173 @@
       </w:r>
       <w:proofErr w:type="spellEnd"/>
       <w:r>
-        <w:t xml:space="preserve"> en </w:t>
+        <w:t>: geholpen met scrumboard en Furkan geholpen.</w:t>
+      </w:r>
+    </w:p>
+    <w:p>
+      <w:pPr>
+        <w:pStyle w:val="Lijstalinea"/>
+        <w:ind w:left="1440"/>
+      </w:pPr>
+    </w:p>
+    <w:p>
+      <w:pPr>
+        <w:pStyle w:val="Lijstalinea"/>
+        <w:ind w:left="1440"/>
+      </w:pPr>
+    </w:p>
+    <w:p>
+      <w:pPr>
+        <w:pStyle w:val="Lijstalinea"/>
+        <w:numPr>
+          <w:ilvl w:val="0"/>
+          <w:numId w:val="1"/>
+        </w:numPr>
+      </w:pPr>
+      <w:r>
+        <w:t xml:space="preserve">Wat ga je nu doen tot de volgende </w:t>
+      </w:r>
+      <w:proofErr w:type="spellStart"/>
+      <w:r>
+        <w:t>standup</w:t>
+      </w:r>
+      <w:proofErr w:type="spellEnd"/>
+      <w:r>
+        <w:t>?</w:t>
+      </w:r>
+    </w:p>
+    <w:p>
+      <w:pPr>
+        <w:pStyle w:val="Lijstalinea"/>
+        <w:numPr>
+          <w:ilvl w:val="1"/>
+          <w:numId w:val="1"/>
+        </w:numPr>
+      </w:pPr>
+      <w:r>
+        <w:t xml:space="preserve">Teamlid </w:t>
+      </w:r>
+      <w:r>
+        <w:t>Furkan</w:t>
+      </w:r>
+      <w:r>
+        <w:t>:</w:t>
+      </w:r>
+      <w:r>
+        <w:t xml:space="preserve"> Tabel maken, </w:t>
+      </w:r>
+      <w:r>
+        <w:t xml:space="preserve">ERD </w:t>
+      </w:r>
+      <w:r>
+        <w:t>maken</w:t>
+      </w:r>
+    </w:p>
+    <w:p>
+      <w:pPr>
+        <w:pStyle w:val="Lijstalinea"/>
+        <w:numPr>
+          <w:ilvl w:val="1"/>
+          <w:numId w:val="1"/>
+        </w:numPr>
+      </w:pPr>
+      <w:r>
+        <w:t xml:space="preserve">Teamlid </w:t>
+      </w:r>
+      <w:proofErr w:type="spellStart"/>
+      <w:r>
+        <w:t>Zhulide</w:t>
+      </w:r>
+      <w:proofErr w:type="spellEnd"/>
+      <w:r>
+        <w:t>:</w:t>
+      </w:r>
+      <w:r>
+        <w:t xml:space="preserve"> Tabel maken, </w:t>
+      </w:r>
+      <w:r>
+        <w:t xml:space="preserve">Website aanpassen </w:t>
+      </w:r>
+    </w:p>
+    <w:p>
+      <w:pPr>
+        <w:pStyle w:val="Lijstalinea"/>
+        <w:numPr>
+          <w:ilvl w:val="1"/>
+          <w:numId w:val="1"/>
+        </w:numPr>
+      </w:pPr>
+      <w:r>
+        <w:t xml:space="preserve">Teamlid </w:t>
+      </w:r>
+      <w:r>
+        <w:t xml:space="preserve">Berke </w:t>
+      </w:r>
+      <w:r>
+        <w:t>:</w:t>
+      </w:r>
+      <w:r>
+        <w:t xml:space="preserve"> Tabel maken, </w:t>
+      </w:r>
+      <w:proofErr w:type="spellStart"/>
+      <w:r>
+        <w:t>Standup</w:t>
+      </w:r>
+      <w:proofErr w:type="spellEnd"/>
+      <w:r>
+        <w:t xml:space="preserve"> </w:t>
+      </w:r>
+      <w:r>
+        <w:t xml:space="preserve">maken </w:t>
+      </w:r>
+    </w:p>
+    <w:p>
+      <w:pPr>
+        <w:pStyle w:val="Lijstalinea"/>
+        <w:numPr>
+          <w:ilvl w:val="1"/>
+          <w:numId w:val="1"/>
+        </w:numPr>
+      </w:pPr>
+      <w:r>
+        <w:t xml:space="preserve">Teamlid </w:t>
       </w:r>
       <w:proofErr w:type="spellStart"/>
       <w:r>
         <w:t>Saied</w:t>
       </w:r>
       <w:proofErr w:type="spellEnd"/>
-    </w:p>
-    <w:p>
-      <w:r>
-        <w:t xml:space="preserve">Datum: </w:t>
-      </w:r>
-      <w:r>
-        <w:t>10-3-2025</w:t>
-      </w:r>
-    </w:p>
+      <w:r>
+        <w:t xml:space="preserve"> </w:t>
+      </w:r>
+      <w:r>
+        <w:t>:</w:t>
+      </w:r>
+      <w:r>
+        <w:t xml:space="preserve"> Tabel maken</w:t>
+      </w:r>
+    </w:p>
+    <w:p>
+      <w:pPr>
+        <w:pStyle w:val="Lijstalinea"/>
+        <w:numPr>
+          <w:ilvl w:val="1"/>
+          <w:numId w:val="1"/>
+        </w:numPr>
+      </w:pPr>
+      <w:r>
+        <w:t xml:space="preserve">Teamlid </w:t>
+      </w:r>
+      <w:proofErr w:type="spellStart"/>
+      <w:r>
+        <w:t>Vitaliy</w:t>
+      </w:r>
+      <w:proofErr w:type="spellEnd"/>
+      <w:r>
+        <w:t>: Tabel maken</w:t>
+      </w:r>
+    </w:p>
+    <w:p/>
     <w:p>
       <w:pPr>
         <w:pStyle w:val="Lijstalinea"/>
@@ -72,15 +399,7 @@
         </w:numPr>
       </w:pPr>
       <w:r>
-        <w:t xml:space="preserve">Wat heb je gedaan sinds de vorige </w:t>
-      </w:r>
-      <w:proofErr w:type="spellStart"/>
-      <w:r>
-        <w:t>standup</w:t>
-      </w:r>
-      <w:proofErr w:type="spellEnd"/>
-      <w:r>
-        <w:t>?</w:t>
+        <w:t>Waar loop je tegen aan ?  (wie kan je helpen)</w:t>
       </w:r>
     </w:p>
     <w:p>
@@ -94,41 +413,12 @@
       <w:r>
         <w:t xml:space="preserve">Teamlid </w:t>
       </w:r>
-      <w:proofErr w:type="spellStart"/>
-      <w:r>
-        <w:t>Furkan</w:t>
-      </w:r>
-      <w:proofErr w:type="spellEnd"/>
+      <w:r>
+        <w:t xml:space="preserve">Berke </w:t>
+      </w:r>
       <w:r>
         <w:t>:</w:t>
       </w:r>
-      <w:r>
-        <w:t xml:space="preserve"> </w:t>
-      </w:r>
-      <w:proofErr w:type="spellStart"/>
-      <w:r>
-        <w:t>Html,css</w:t>
-      </w:r>
-      <w:proofErr w:type="spellEnd"/>
-      <w:r>
-        <w:t xml:space="preserve"> scrumboard gemaakt alles in </w:t>
-      </w:r>
-      <w:proofErr w:type="spellStart"/>
-      <w:r>
-        <w:t>Github</w:t>
-      </w:r>
-      <w:proofErr w:type="spellEnd"/>
-      <w:r>
-        <w:t xml:space="preserve"> gezet en </w:t>
-      </w:r>
-      <w:proofErr w:type="spellStart"/>
-      <w:r>
-        <w:t>wireframes</w:t>
-      </w:r>
-      <w:proofErr w:type="spellEnd"/>
-      <w:r>
-        <w:t xml:space="preserve"> gemaakt.</w:t>
-      </w:r>
     </w:p>
     <w:p>
       <w:pPr>
@@ -141,320 +431,8 @@
       <w:r>
         <w:t xml:space="preserve">Teamlid </w:t>
       </w:r>
-      <w:proofErr w:type="spellStart"/>
-      <w:r>
-        <w:t>Zhulide</w:t>
-      </w:r>
-      <w:proofErr w:type="spellEnd"/>
-      <w:r>
-        <w:t>:</w:t>
-      </w:r>
-      <w:r>
-        <w:t xml:space="preserve"> Kleding maken en homepagina ontworpen en ze heeft homepage aangepast.</w:t>
-      </w:r>
-    </w:p>
-    <w:p>
-      <w:pPr>
-        <w:pStyle w:val="Lijstalinea"/>
-        <w:numPr>
-          <w:ilvl w:val="1"/>
-          <w:numId w:val="1"/>
-        </w:numPr>
-      </w:pPr>
-      <w:r>
-        <w:t xml:space="preserve">Teamlid </w:t>
-      </w:r>
-      <w:r>
-        <w:t>Berke</w:t>
-      </w:r>
-      <w:r>
-        <w:t>:</w:t>
-      </w:r>
-      <w:r>
-        <w:t xml:space="preserve"> Alle verslagen gemaakt en alles bijgehouden</w:t>
-      </w:r>
-    </w:p>
-    <w:p>
-      <w:pPr>
-        <w:pStyle w:val="Lijstalinea"/>
-        <w:numPr>
-          <w:ilvl w:val="1"/>
-          <w:numId w:val="1"/>
-        </w:numPr>
-      </w:pPr>
-      <w:r>
-        <w:t xml:space="preserve">Teamlid </w:t>
-      </w:r>
-      <w:proofErr w:type="spellStart"/>
-      <w:r>
-        <w:t>Saied</w:t>
-      </w:r>
-      <w:proofErr w:type="spellEnd"/>
-      <w:r>
-        <w:t>:</w:t>
-      </w:r>
-      <w:r>
-        <w:t xml:space="preserve"> </w:t>
-      </w:r>
-      <w:proofErr w:type="spellStart"/>
-      <w:r>
-        <w:t>Github</w:t>
-      </w:r>
-      <w:proofErr w:type="spellEnd"/>
-      <w:r>
-        <w:t xml:space="preserve"> </w:t>
-      </w:r>
-      <w:proofErr w:type="spellStart"/>
-      <w:r>
-        <w:t>repository</w:t>
-      </w:r>
-      <w:proofErr w:type="spellEnd"/>
-      <w:r>
-        <w:t xml:space="preserve"> gemaakt en mappenstructuur aangemaakt.</w:t>
-      </w:r>
-    </w:p>
-    <w:p>
-      <w:pPr>
-        <w:pStyle w:val="Lijstalinea"/>
-        <w:numPr>
-          <w:ilvl w:val="1"/>
-          <w:numId w:val="1"/>
-        </w:numPr>
-      </w:pPr>
-      <w:r>
-        <w:t xml:space="preserve">Teamlid </w:t>
-      </w:r>
-      <w:proofErr w:type="spellStart"/>
-      <w:r>
-        <w:t>Vitaliy</w:t>
-      </w:r>
-      <w:proofErr w:type="spellEnd"/>
-      <w:r>
-        <w:t xml:space="preserve">: geholpen met scrumboard en </w:t>
-      </w:r>
-      <w:proofErr w:type="spellStart"/>
-      <w:r>
-        <w:t>Furkan</w:t>
-      </w:r>
-      <w:proofErr w:type="spellEnd"/>
-      <w:r>
-        <w:t xml:space="preserve"> geholpen.</w:t>
-      </w:r>
-    </w:p>
-    <w:p>
-      <w:pPr>
-        <w:pStyle w:val="Lijstalinea"/>
-        <w:ind w:left="1440"/>
-      </w:pPr>
-    </w:p>
-    <w:p>
-      <w:pPr>
-        <w:pStyle w:val="Lijstalinea"/>
-        <w:ind w:left="1440"/>
-      </w:pPr>
-    </w:p>
-    <w:p>
-      <w:pPr>
-        <w:pStyle w:val="Lijstalinea"/>
-        <w:numPr>
-          <w:ilvl w:val="0"/>
-          <w:numId w:val="1"/>
-        </w:numPr>
-      </w:pPr>
-      <w:r>
-        <w:t xml:space="preserve">Wat ga je nu doen tot de volgende </w:t>
-      </w:r>
-      <w:proofErr w:type="spellStart"/>
-      <w:r>
-        <w:t>standup</w:t>
-      </w:r>
-      <w:proofErr w:type="spellEnd"/>
-      <w:r>
-        <w:t>?</w:t>
-      </w:r>
-    </w:p>
-    <w:p>
-      <w:pPr>
-        <w:pStyle w:val="Lijstalinea"/>
-        <w:numPr>
-          <w:ilvl w:val="1"/>
-          <w:numId w:val="1"/>
-        </w:numPr>
-      </w:pPr>
-      <w:r>
-        <w:t xml:space="preserve">Teamlid </w:t>
-      </w:r>
-      <w:proofErr w:type="spellStart"/>
-      <w:r>
-        <w:t>Furkan</w:t>
-      </w:r>
-      <w:proofErr w:type="spellEnd"/>
-      <w:r>
-        <w:t>:</w:t>
-      </w:r>
-      <w:r>
-        <w:t xml:space="preserve"> Tabel maken, </w:t>
-      </w:r>
-      <w:r>
-        <w:t xml:space="preserve">ERD </w:t>
-      </w:r>
-      <w:r>
-        <w:t>maken</w:t>
-      </w:r>
-    </w:p>
-    <w:p>
-      <w:pPr>
-        <w:pStyle w:val="Lijstalinea"/>
-        <w:numPr>
-          <w:ilvl w:val="1"/>
-          <w:numId w:val="1"/>
-        </w:numPr>
-      </w:pPr>
-      <w:r>
-        <w:t xml:space="preserve">Teamlid </w:t>
-      </w:r>
-      <w:proofErr w:type="spellStart"/>
-      <w:r>
-        <w:t>Zhulide</w:t>
-      </w:r>
-      <w:proofErr w:type="spellEnd"/>
-      <w:r>
-        <w:t>:</w:t>
-      </w:r>
-      <w:r>
-        <w:t xml:space="preserve"> Tabel maken, </w:t>
-      </w:r>
-      <w:r>
-        <w:t xml:space="preserve">Website aanpassen </w:t>
-      </w:r>
-    </w:p>
-    <w:p>
-      <w:pPr>
-        <w:pStyle w:val="Lijstalinea"/>
-        <w:numPr>
-          <w:ilvl w:val="1"/>
-          <w:numId w:val="1"/>
-        </w:numPr>
-      </w:pPr>
-      <w:r>
-        <w:t xml:space="preserve">Teamlid </w:t>
-      </w:r>
-      <w:r>
-        <w:t xml:space="preserve">Berke </w:t>
-      </w:r>
-      <w:r>
-        <w:t>:</w:t>
-      </w:r>
-      <w:r>
-        <w:t xml:space="preserve"> Tabel maken, </w:t>
-      </w:r>
-      <w:proofErr w:type="spellStart"/>
-      <w:r>
-        <w:t>Standup</w:t>
-      </w:r>
-      <w:proofErr w:type="spellEnd"/>
-      <w:r>
-        <w:t xml:space="preserve"> </w:t>
-      </w:r>
-      <w:r>
-        <w:t xml:space="preserve">maken </w:t>
-      </w:r>
-    </w:p>
-    <w:p>
-      <w:pPr>
-        <w:pStyle w:val="Lijstalinea"/>
-        <w:numPr>
-          <w:ilvl w:val="1"/>
-          <w:numId w:val="1"/>
-        </w:numPr>
-      </w:pPr>
-      <w:r>
-        <w:t xml:space="preserve">Teamlid </w:t>
-      </w:r>
-      <w:proofErr w:type="spellStart"/>
-      <w:r>
-        <w:t>Saied</w:t>
-      </w:r>
-      <w:proofErr w:type="spellEnd"/>
-      <w:r>
-        <w:t xml:space="preserve"> </w:t>
-      </w:r>
-      <w:r>
-        <w:t>:</w:t>
-      </w:r>
-      <w:r>
-        <w:t xml:space="preserve"> Tabel maken</w:t>
-      </w:r>
-    </w:p>
-    <w:p>
-      <w:pPr>
-        <w:pStyle w:val="Lijstalinea"/>
-        <w:numPr>
-          <w:ilvl w:val="1"/>
-          <w:numId w:val="1"/>
-        </w:numPr>
-      </w:pPr>
-      <w:r>
-        <w:t xml:space="preserve">Teamlid </w:t>
-      </w:r>
-      <w:proofErr w:type="spellStart"/>
-      <w:r>
-        <w:t>Vitaliy</w:t>
-      </w:r>
-      <w:proofErr w:type="spellEnd"/>
-      <w:r>
-        <w:t>: Tabel maken</w:t>
-      </w:r>
-    </w:p>
-    <w:p/>
-    <w:p>
-      <w:pPr>
-        <w:pStyle w:val="Lijstalinea"/>
-        <w:numPr>
-          <w:ilvl w:val="0"/>
-          <w:numId w:val="1"/>
-        </w:numPr>
-      </w:pPr>
-      <w:r>
-        <w:t>Waar loop je tegen aan ?  (wie kan je helpen)</w:t>
-      </w:r>
-    </w:p>
-    <w:p>
-      <w:pPr>
-        <w:pStyle w:val="Lijstalinea"/>
-        <w:numPr>
-          <w:ilvl w:val="1"/>
-          <w:numId w:val="1"/>
-        </w:numPr>
-      </w:pPr>
-      <w:r>
-        <w:t xml:space="preserve">Teamlid </w:t>
-      </w:r>
-      <w:r>
-        <w:t xml:space="preserve">Berke </w:t>
-      </w:r>
-      <w:r>
-        <w:t>:</w:t>
-      </w:r>
-    </w:p>
-    <w:p>
-      <w:pPr>
-        <w:pStyle w:val="Lijstalinea"/>
-        <w:numPr>
-          <w:ilvl w:val="1"/>
-          <w:numId w:val="1"/>
-        </w:numPr>
-      </w:pPr>
-      <w:r>
-        <w:t xml:space="preserve">Teamlid </w:t>
-      </w:r>
-      <w:proofErr w:type="spellStart"/>
-      <w:r>
-        <w:t>Furkan</w:t>
-      </w:r>
-      <w:proofErr w:type="spellEnd"/>
-      <w:r>
-        <w:t xml:space="preserve"> </w:t>
+      <w:r>
+        <w:t xml:space="preserve">Furkan </w:t>
       </w:r>
       <w:r>
         <w:t>:</w:t>

</xml_diff>